<commit_message>
Change protein of interest category name
</commit_message>
<xml_diff>
--- a/ZC4H2 Unravel overlap.docx
+++ b/ZC4H2 Unravel overlap.docx
@@ -261,7 +261,7 @@
                 <w:rFonts w:ascii="Calibri" w:hAnsi="Calibri"/>
                 <w:sz w:val="20"/>
               </w:rPr>
-              <w:t xml:space="preserve">Protein of interest modulator</w:t>
+              <w:t xml:space="preserve">↑ ZC4H2</w:t>
             </w:r>
           </w:p>
         </w:tc>
@@ -414,7 +414,7 @@
                 <w:rFonts w:ascii="Calibri" w:hAnsi="Calibri"/>
                 <w:sz w:val="20"/>
               </w:rPr>
-              <w:t xml:space="preserve">Protein of interest modulator, Neurotransmitter modulator</w:t>
+              <w:t xml:space="preserve">↑ ZC4H2, Neurotransmitter modulator</w:t>
             </w:r>
           </w:p>
         </w:tc>
@@ -568,7 +568,7 @@
                 <w:rFonts w:ascii="Calibri" w:hAnsi="Calibri"/>
                 <w:sz w:val="20"/>
               </w:rPr>
-              <w:t xml:space="preserve">Protein of interest modulator</w:t>
+              <w:t xml:space="preserve">↑ ZC4H2</w:t>
             </w:r>
           </w:p>
         </w:tc>
@@ -721,7 +721,7 @@
                 <w:rFonts w:ascii="Calibri" w:hAnsi="Calibri"/>
                 <w:sz w:val="20"/>
               </w:rPr>
-              <w:t xml:space="preserve">Symptomatic relief, Protein of interest modulator</w:t>
+              <w:t xml:space="preserve">Symptomatic relief, ↑ ZC4H2</w:t>
             </w:r>
           </w:p>
         </w:tc>
@@ -1405,7 +1405,7 @@
                 <w:rFonts w:ascii="Calibri" w:hAnsi="Calibri"/>
                 <w:sz w:val="20"/>
               </w:rPr>
-              <w:t xml:space="preserve">Protein of interest modulator, Neurotransmitter modulator</w:t>
+              <w:t xml:space="preserve">↑ ZC4H2, Neurotransmitter modulator</w:t>
             </w:r>
           </w:p>
         </w:tc>
@@ -1558,7 +1558,7 @@
                 <w:rFonts w:ascii="Calibri" w:hAnsi="Calibri"/>
                 <w:sz w:val="20"/>
               </w:rPr>
-              <w:t xml:space="preserve">Protein of interest modulator, Neurotransmitter modulator</w:t>
+              <w:t xml:space="preserve">↑ ZC4H2, Neurotransmitter modulator</w:t>
             </w:r>
           </w:p>
         </w:tc>
@@ -1712,7 +1712,7 @@
                 <w:rFonts w:ascii="Calibri" w:hAnsi="Calibri"/>
                 <w:sz w:val="20"/>
               </w:rPr>
-              <w:t xml:space="preserve">Neurotransmitter modulator, Protein of interest modulator</w:t>
+              <w:t xml:space="preserve">Neurotransmitter modulator, ↑ ZC4H2</w:t>
             </w:r>
           </w:p>
         </w:tc>
@@ -2270,7 +2270,7 @@
                 <w:rFonts w:ascii="Calibri" w:hAnsi="Calibri"/>
                 <w:sz w:val="20"/>
               </w:rPr>
-              <w:t xml:space="preserve">Protein of interest modulator</w:t>
+              <w:t xml:space="preserve">↑ ZC4H2</w:t>
             </w:r>
           </w:p>
         </w:tc>
@@ -2423,7 +2423,7 @@
                 <w:rFonts w:ascii="Calibri" w:hAnsi="Calibri"/>
                 <w:sz w:val="20"/>
               </w:rPr>
-              <w:t xml:space="preserve">Protein of interest modulator</w:t>
+              <w:t xml:space="preserve">↑ ZC4H2</w:t>
             </w:r>
           </w:p>
         </w:tc>
@@ -2577,7 +2577,7 @@
                 <w:rFonts w:ascii="Calibri" w:hAnsi="Calibri"/>
                 <w:sz w:val="20"/>
               </w:rPr>
-              <w:t xml:space="preserve">Protein of interest modulator, Neurotransmitter modulator</w:t>
+              <w:t xml:space="preserve">↑ ZC4H2, Neurotransmitter modulator</w:t>
             </w:r>
           </w:p>
         </w:tc>
@@ -2856,7 +2856,7 @@
                 <w:rFonts w:ascii="Calibri" w:hAnsi="Calibri"/>
                 <w:sz w:val="20"/>
               </w:rPr>
-              <w:t xml:space="preserve">Protein of interest modulator, Neurotransmitter modulator</w:t>
+              <w:t xml:space="preserve">↑ ZC4H2, Neurotransmitter modulator</w:t>
             </w:r>
           </w:p>
         </w:tc>
@@ -3149,7 +3149,7 @@
                 <w:rFonts w:ascii="Calibri" w:hAnsi="Calibri"/>
                 <w:sz w:val="20"/>
               </w:rPr>
-              <w:t xml:space="preserve">Protein of interest modulator, Neurotransmitter modulator</w:t>
+              <w:t xml:space="preserve">↑ ZC4H2, Neurotransmitter modulator</w:t>
             </w:r>
           </w:p>
         </w:tc>
@@ -3302,7 +3302,7 @@
                 <w:rFonts w:ascii="Calibri" w:hAnsi="Calibri"/>
                 <w:sz w:val="20"/>
               </w:rPr>
-              <w:t xml:space="preserve">Symptomatic relief, Protein of interest modulator</w:t>
+              <w:t xml:space="preserve">Symptomatic relief, ↑ ZC4H2</w:t>
             </w:r>
           </w:p>
         </w:tc>
@@ -3581,7 +3581,7 @@
                 <w:rFonts w:ascii="Calibri" w:hAnsi="Calibri"/>
                 <w:sz w:val="20"/>
               </w:rPr>
-              <w:t xml:space="preserve">Protein of interest modulator</w:t>
+              <w:t xml:space="preserve">↑ ZC4H2</w:t>
             </w:r>
           </w:p>
         </w:tc>
@@ -3860,7 +3860,7 @@
                 <w:rFonts w:ascii="Calibri" w:hAnsi="Calibri"/>
                 <w:sz w:val="20"/>
               </w:rPr>
-              <w:t xml:space="preserve">Protein of interest modulator</w:t>
+              <w:t xml:space="preserve">↑ ZC4H2</w:t>
             </w:r>
           </w:p>
         </w:tc>
@@ -4000,7 +4000,7 @@
                 <w:rFonts w:ascii="Calibri" w:hAnsi="Calibri"/>
                 <w:sz w:val="20"/>
               </w:rPr>
-              <w:t xml:space="preserve">Protein of interest modulator</w:t>
+              <w:t xml:space="preserve">↑ ZC4H2</w:t>
             </w:r>
           </w:p>
         </w:tc>
@@ -4153,7 +4153,7 @@
                 <w:rFonts w:ascii="Calibri" w:hAnsi="Calibri"/>
                 <w:sz w:val="20"/>
               </w:rPr>
-              <w:t xml:space="preserve">Neurotransmitter modulator, Protein of interest modulator</w:t>
+              <w:t xml:space="preserve">Neurotransmitter modulator, ↑ ZC4H2</w:t>
             </w:r>
           </w:p>
         </w:tc>
@@ -4307,7 +4307,7 @@
                 <w:rFonts w:ascii="Calibri" w:hAnsi="Calibri"/>
                 <w:sz w:val="20"/>
               </w:rPr>
-              <w:t xml:space="preserve">Protein of interest modulator</w:t>
+              <w:t xml:space="preserve">↑ ZC4H2</w:t>
             </w:r>
           </w:p>
         </w:tc>
@@ -4600,7 +4600,7 @@
                 <w:rFonts w:ascii="Calibri" w:hAnsi="Calibri"/>
                 <w:sz w:val="20"/>
               </w:rPr>
-              <w:t xml:space="preserve">Protein of interest modulator</w:t>
+              <w:t xml:space="preserve">↑ ZC4H2</w:t>
             </w:r>
           </w:p>
         </w:tc>
@@ -4739,7 +4739,7 @@
                 <w:rFonts w:ascii="Calibri" w:hAnsi="Calibri"/>
                 <w:sz w:val="20"/>
               </w:rPr>
-              <w:t xml:space="preserve">Protein of interest modulator</w:t>
+              <w:t xml:space="preserve">↑ ZC4H2</w:t>
             </w:r>
           </w:p>
         </w:tc>
@@ -4893,7 +4893,7 @@
                 <w:rFonts w:ascii="Calibri" w:hAnsi="Calibri"/>
                 <w:sz w:val="20"/>
               </w:rPr>
-              <w:t xml:space="preserve">Neurotransmitter modulator, Protein of interest modulator</w:t>
+              <w:t xml:space="preserve">Neurotransmitter modulator, ↑ ZC4H2</w:t>
             </w:r>
           </w:p>
         </w:tc>
@@ -5046,7 +5046,7 @@
                 <w:rFonts w:ascii="Calibri" w:hAnsi="Calibri"/>
                 <w:sz w:val="20"/>
               </w:rPr>
-              <w:t xml:space="preserve">Neurotransmitter modulator, Protein of interest modulator</w:t>
+              <w:t xml:space="preserve">Neurotransmitter modulator, ↑ ZC4H2</w:t>
             </w:r>
           </w:p>
         </w:tc>
@@ -5200,7 +5200,7 @@
                 <w:rFonts w:ascii="Calibri" w:hAnsi="Calibri"/>
                 <w:sz w:val="20"/>
               </w:rPr>
-              <w:t xml:space="preserve">Neurotransmitter modulator, Protein of interest modulator</w:t>
+              <w:t xml:space="preserve">Neurotransmitter modulator, ↑ ZC4H2</w:t>
             </w:r>
           </w:p>
         </w:tc>
@@ -5353,7 +5353,7 @@
                 <w:rFonts w:ascii="Calibri" w:hAnsi="Calibri"/>
                 <w:sz w:val="20"/>
               </w:rPr>
-              <w:t xml:space="preserve">Protein of interest modulator, Increase neuroplasticity, Increase dendritic spine density</w:t>
+              <w:t xml:space="preserve">↑ ZC4H2, Increase neuroplasticity, Increase dendritic spine density</w:t>
             </w:r>
           </w:p>
         </w:tc>
@@ -5911,7 +5911,7 @@
                 <w:rFonts w:ascii="Calibri" w:hAnsi="Calibri"/>
                 <w:sz w:val="20"/>
               </w:rPr>
-              <w:t xml:space="preserve">Protein of interest modulator</w:t>
+              <w:t xml:space="preserve">↑ ZC4H2</w:t>
             </w:r>
           </w:p>
         </w:tc>
@@ -6316,7 +6316,7 @@
                 <w:rFonts w:ascii="Calibri" w:hAnsi="Calibri"/>
                 <w:sz w:val="20"/>
               </w:rPr>
-              <w:t xml:space="preserve">Protein of interest modulator</w:t>
+              <w:t xml:space="preserve">↑ ZC4H2</w:t>
             </w:r>
           </w:p>
         </w:tc>
@@ -6595,7 +6595,7 @@
                 <w:rFonts w:ascii="Calibri" w:hAnsi="Calibri"/>
                 <w:sz w:val="20"/>
               </w:rPr>
-              <w:t xml:space="preserve">Protein of interest modulator</w:t>
+              <w:t xml:space="preserve">↑ ZC4H2</w:t>
             </w:r>
           </w:p>
         </w:tc>
@@ -6734,7 +6734,7 @@
                 <w:rFonts w:ascii="Calibri" w:hAnsi="Calibri"/>
                 <w:sz w:val="20"/>
               </w:rPr>
-              <w:t xml:space="preserve">Neurotransmitter modulator, Protein of interest modulator</w:t>
+              <w:t xml:space="preserve">Neurotransmitter modulator, ↑ ZC4H2</w:t>
             </w:r>
           </w:p>
         </w:tc>
@@ -6888,7 +6888,7 @@
                 <w:rFonts w:ascii="Calibri" w:hAnsi="Calibri"/>
                 <w:sz w:val="20"/>
               </w:rPr>
-              <w:t xml:space="preserve">Protein of interest modulator, Neurotransmitter modulator</w:t>
+              <w:t xml:space="preserve">↑ ZC4H2, Neurotransmitter modulator</w:t>
             </w:r>
           </w:p>
         </w:tc>
@@ -7557,7 +7557,7 @@
                 <w:rFonts w:ascii="Calibri" w:hAnsi="Calibri"/>
                 <w:sz w:val="20"/>
               </w:rPr>
-              <w:t xml:space="preserve">Increase neuroplasticity, Increase dendritic spine density, Protein of interest modulator</w:t>
+              <w:t xml:space="preserve">Increase neuroplasticity, Increase dendritic spine density, ↑ ZC4H2</w:t>
             </w:r>
           </w:p>
         </w:tc>

</xml_diff>